<commit_message>
feat: ajout de la logique d'exclusion de SPF pour  les residences universitaire logements ordinaires et residences
</commit_message>
<xml_diff>
--- a/documents/Foyer-template.docx
+++ b/documents/Foyer-template.docx
@@ -175,11 +175,7 @@
         <w:t>1</w:t>
       </w:r>
       <w:r>
-        <w:t xml:space="preserve">], représenté (e) {%  if convention.signataire_nom %} {{ convention.signataire_nom }}, {{ convention.signataire_fonction }}{% else %} {{ bailleur.signataire_nom }}, {{ bailleur.signataire_fonction }}{% endif %} agissant en </w:t>
-      </w:r>
-      <w:r>
-        <w:lastRenderedPageBreak/>
-        <w:t xml:space="preserve">vertu de la délibération du Conseil d’Administration en date du {%  if convention.signataire_date_deliberation %}{{ convention.signataire_date_deliberation|d }}{% else %}{{ bailleur.signataire_date_deliberation|d }}{% endif %}, inscrit sous le numéro </w:t>
+        <w:t xml:space="preserve">], représenté (e) {%  if convention.signataire_nom %} {{ convention.signataire_nom }}, {{ convention.signataire_fonction }}{% else %} {{ bailleur.signataire_nom }}, {{ bailleur.signataire_fonction }}{% endif %} agissant en vertu de la délibération du Conseil d’Administration en date du {%  if convention.signataire_date_deliberation %}{{ convention.signataire_date_deliberation|d }}{% else %}{{ bailleur.signataire_date_deliberation|d }}{% endif %}, inscrit sous le numéro </w:t>
       </w:r>
       <w:bookmarkStart w:id="0" w:name="Siret1"/>
       <w:bookmarkEnd w:id="0"/>
@@ -216,7 +212,14 @@
         <w:rPr>
           <w:rFonts w:eastAsia="Arial Unicode MS"/>
         </w:rPr>
-        <w:t>{{ convention.gestionnaire|default_str_if_none|upper }} [Organisme agréé gestionnaire du logement-foyer, sauf dans le cas où le propriétaire est gestionnaire direct] représenté (e) par {{ convention.gestionnaire_signataire_nom|default_str_if_none }}, {{ convention.gestionnaire_signataire_fonction|default_str_if_none }} agissant en vertu de la délibération du Conseil d’Administration en date du {{ convention.gestionnaire_signataire_date_deliberation|dd }}, {{ convention.</w:t>
+        <w:t xml:space="preserve">{{ convention.gestionnaire|default_str_if_none|upper }} [Organisme agréé gestionnaire du logement-foyer, sauf dans le cas où le propriétaire est gestionnaire direct] représenté (e) par {{ convention.gestionnaire_signataire_nom|default_str_if_none }}, {{ convention.gestionnaire_signataire_fonction|default_str_if_none }} agissant en vertu de la délibération du Conseil d’Administration en date du {{ </w:t>
+      </w:r>
+      <w:r>
+        <w:rPr>
+          <w:rFonts w:eastAsia="Arial Unicode MS"/>
+        </w:rPr>
+        <w:lastRenderedPageBreak/>
+        <w:t>convention.gestionnaire_signataire_date_deliberation|dd }}, {{ convention.</w:t>
       </w:r>
       <w:r>
         <w:t xml:space="preserve"> </w:t>
@@ -3954,6 +3957,7 @@
         <w:rPr>
           <w:i/>
           <w:iCs/>
+          <w:color w:val="000000"/>
         </w:rPr>
       </w:pPr>
       <w:r>
@@ -3962,53 +3966,42 @@
           <w:iCs/>
           <w:color w:val="000000"/>
         </w:rPr>
-        <w:t>Publication</w:t>
-      </w:r>
-    </w:p>
-    <w:p>
-      <w:pPr>
-        <w:jc w:val="both"/>
-      </w:pPr>
-    </w:p>
-    <w:p>
-      <w:pPr>
-        <w:jc w:val="both"/>
-      </w:pPr>
-      <w:r>
-        <w:rPr>
-          <w:color w:val="000000"/>
-        </w:rPr>
-        <w:t>La publication de la convention, de sa résiliation et de ses éventuels avenants au fichier immobilier ou leur inscription au livre foncier incombe au préfet ou, lorsqu'un établissement public de coopération intercommunale, un département, la métropole de Lyon, la métropole du Grand Paris, la métropole d’Aix-Marseille-Provence, une métropole ou la collectivité de Corse a signé une convention mentionnée au II de l’article L. 301-5-1 ou à l’article L. 301-5-2 du code de la construction et de l'habitation, ou à l’article L. 3641-5, au VI de l’article L. 5219-1, au II de l’article L. 5218-2 ou au II de l’article L. 5217-2 du code général des collectivités territoriales, au président de l'établissement public de coopération intercommunale, du conseil départemental, de la métropole de Lyon, de la métropole du Grand Paris, de la métropole d’Aix-Marseille-Provence, de la métropole ou du conseil exécutif de Corse. Les frais de publication sont à la charge du propriétaire.</w:t>
-      </w:r>
-    </w:p>
-    <w:p>
-      <w:pPr>
-        <w:jc w:val="both"/>
-      </w:pPr>
-    </w:p>
-    <w:p>
-      <w:pPr>
-        <w:jc w:val="both"/>
-      </w:pPr>
-      <w:r>
-        <w:rPr>
-          <w:color w:val="000000"/>
-        </w:rPr>
-        <w:t>Le préfet, ou, lorsqu'un établissement public de coopération intercommunale, un département, la métropole de Lyon, la métropole du Grand Paris, la métropole d’Aix-</w:t>
-      </w:r>
-      <w:r>
-        <w:rPr>
-          <w:color w:val="000000"/>
-        </w:rPr>
-        <w:lastRenderedPageBreak/>
-        <w:t>Marseille-Provence, une métropole ou la collectivité de Corse a signé une convention mentionnée au II de l’article L. 301</w:t>
+        <w:t>Information des organismes chargés de la liquidation et du paiement de l’aide personnalisée au logement</w:t>
+      </w:r>
+    </w:p>
+    <w:p>
+      <w:pPr>
+        <w:jc w:val="both"/>
+      </w:pPr>
+    </w:p>
+    <w:p>
+      <w:pPr>
+        <w:jc w:val="both"/>
+      </w:pPr>
+      <w:r>
+        <w:rPr>
+          <w:color w:val="000000"/>
+        </w:rPr>
+        <w:t>Le préfet, ou, lorsqu'un établissement public de coopération intercommunale, un département, la métropole de Lyon, la métropole du Grand Paris, la métropole d’Aix-Marseille-Provence, une métropole ou la collectivité de Corse a signé une convention mentionnée au II de l’article L. 301</w:t>
       </w:r>
       <w:r>
         <w:rPr>
           <w:color w:val="000000"/>
         </w:rPr>
         <w:noBreakHyphen/>
-        <w:t>5-1 ou à l’article L. 301-5-2 du code de la construction et de l'habitation, ou à l’article L. 3641-5, au VI de l’article L. 5219-1, au II de l’article L. 5218-2 ou au II de l’article L. 5217-2 du code général des collectivités territoriales, le président de l'établissement public de coopération intercommunale, du conseil départemental, de la métropole de Lyon, de la métropole du Grand Paris, de la métropole d’Aix-Marseille-Provence, de la métropole ou du conseil exécutif de Corse, transmet aux organismes chargés de la liquidation et du paiement de l'aide personnalisée au logement une copie de la présente convention, de ses avenants éventuels ainsi que l'état prouvant qu'elle (ou ils) a (ont) bien fait l'objet d'une publication au fichier immobilier (ou d'une inscription au livre foncier).{% endif %}</w:t>
+        <w:t>5-1 ou à l’article L. 301-5-2 du code de la construction et de l'habitation, ou à l’article L. 3641-5, au VI de l’article L. 5219-1, au II de l’article L. 5218-2 ou au II de l’article L. 5217-2 du code général des collectivités territoriales, le président de l'établissement public de coopération intercommunale, du conseil départemental, de la métropole de Lyon, de la métropole du Grand Paris, de la métropole d’Aix-Marseille-Provence, de la métropole ou du conseil exécutif de Corse, transmet aux organismes chargés de la liquidation et du paiement de l'aide personnalisée au logement une copie de la présente convention</w:t>
+      </w:r>
+      <w:r>
+        <w:rPr>
+          <w:color w:val="000000"/>
+        </w:rPr>
+        <w:t xml:space="preserve"> et de ses avenants éventuels</w:t>
+      </w:r>
+      <w:r>
+        <w:rPr>
+          <w:color w:val="000000"/>
+        </w:rPr>
+        <w:t>.{% endif %}</w:t>
       </w:r>
     </w:p>
     <w:p>
@@ -10240,493 +10233,6 @@
 
 <file path=word/header3.xml><?xml version="1.0" encoding="utf-8"?>
 <w:hdr xmlns:wpc="http://schemas.microsoft.com/office/word/2010/wordprocessingCanvas" xmlns:cx="http://schemas.microsoft.com/office/drawing/2014/chartex" xmlns:cx1="http://schemas.microsoft.com/office/drawing/2015/9/8/chartex" xmlns:cx2="http://schemas.microsoft.com/office/drawing/2015/10/21/chartex" xmlns:cx3="http://schemas.microsoft.com/office/drawing/2016/5/9/chartex" xmlns:cx4="http://schemas.microsoft.com/office/drawing/2016/5/10/chartex" xmlns:cx5="http://schemas.microsoft.com/office/drawing/2016/5/11/chartex" xmlns:cx6="http://schemas.microsoft.com/office/drawing/2016/5/12/chartex" xmlns:cx7="http://schemas.microsoft.com/office/drawing/2016/5/13/chartex" xmlns:cx8="http://schemas.microsoft.com/office/drawing/2016/5/14/chartex" xmlns:mc="http://schemas.openxmlformats.org/markup-compatibility/2006" xmlns:aink="http://schemas.microsoft.com/office/drawing/2016/ink" xmlns:am3d="http://schemas.microsoft.com/office/drawing/2017/model3d" xmlns:o="urn:schemas-microsoft-com:office:office" xmlns:oel="http://schemas.microsoft.com/office/2019/extlst" xmlns:r="http://schemas.openxmlformats.org/officeDocument/2006/relationships" xmlns:m="http://schemas.openxmlformats.org/officeDocument/2006/math" xmlns:v="urn:schemas-microsoft-com:vml" xmlns:wp14="http://schemas.microsoft.com/office/word/2010/wordprocessingDrawing" xmlns:wp="http://schemas.openxmlformats.org/drawingml/2006/wordprocessingDrawing" xmlns:w10="urn:schemas-microsoft-com:office:word" xmlns:w="http://schemas.openxmlformats.org/wordprocessingml/2006/main" xmlns:w14="http://schemas.microsoft.com/office/word/2010/wordml" xmlns:w15="http://schemas.microsoft.com/office/word/2012/wordml" xmlns:w16cex="http://schemas.microsoft.com/office/word/2018/wordml/cex" xmlns:w16cid="http://schemas.microsoft.com/office/word/2016/wordml/cid" xmlns:w16="http://schemas.microsoft.com/office/word/2018/wordml" xmlns:w16du="http://schemas.microsoft.com/office/word/2023/wordml/word16du" xmlns:w16sdtdh="http://schemas.microsoft.com/office/word/2020/wordml/sdtdatahash" xmlns:w16sdtfl="http://schemas.microsoft.com/office/word/2024/wordml/sdtformatlock" xmlns:w16se="http://schemas.microsoft.com/office/word/2015/wordml/symex" xmlns:wpg="http://schemas.microsoft.com/office/word/2010/wordprocessingGroup" xmlns:wpi="http://schemas.microsoft.com/office/word/2010/wordprocessingInk" xmlns:wne="http://schemas.microsoft.com/office/word/2006/wordml" xmlns:wps="http://schemas.microsoft.com/office/word/2010/wordprocessingShape" mc:Ignorable="w14 w15 w16se w16cid w16 w16cex w16sdtdh w16sdtfl w16du wp14">
-  <w:tbl>
-    <w:tblPr>
-      <w:tblStyle w:val="Grilledutableau"/>
-      <w:tblW w:w="8460" w:type="dxa"/>
-      <w:jc w:val="center"/>
-      <w:tblLayout w:type="fixed"/>
-      <w:tblLook w:val="04A0" w:firstRow="1" w:lastRow="0" w:firstColumn="1" w:lastColumn="0" w:noHBand="0" w:noVBand="1"/>
-    </w:tblPr>
-    <w:tblGrid>
-      <w:gridCol w:w="2937"/>
-      <w:gridCol w:w="2083"/>
-      <w:gridCol w:w="3440"/>
-    </w:tblGrid>
-    <w:tr>
-      <w:trPr>
-        <w:jc w:val="center"/>
-      </w:trPr>
-      <w:tc>
-        <w:tcPr>
-          <w:tcW w:w="8460" w:type="dxa"/>
-          <w:gridSpan w:val="3"/>
-          <w:tcBorders>
-            <w:top w:val="nil"/>
-            <w:left w:val="nil"/>
-            <w:right w:val="nil"/>
-          </w:tcBorders>
-        </w:tcPr>
-        <w:p>
-          <w:pPr>
-            <w:rPr>
-              <w:sz w:val="12"/>
-              <w:szCs w:val="12"/>
-            </w:rPr>
-          </w:pPr>
-        </w:p>
-        <w:p>
-          <w:pPr>
-            <w:jc w:val="center"/>
-          </w:pPr>
-          <w:r>
-            <w:rPr>
-              <w:noProof/>
-            </w:rPr>
-            <mc:AlternateContent>
-              <mc:Choice Requires="wps">
-                <w:drawing>
-                  <wp:anchor distT="0" distB="0" distL="0" distR="0" simplePos="0" relativeHeight="251655680" behindDoc="1" locked="0" layoutInCell="1" allowOverlap="1" wp14:anchorId="1C70B8E9" wp14:editId="2B727346">
-                    <wp:simplePos x="0" y="0"/>
-                    <wp:positionH relativeFrom="column">
-                      <wp:posOffset>4092575</wp:posOffset>
-                    </wp:positionH>
-                    <wp:positionV relativeFrom="page">
-                      <wp:posOffset>184785</wp:posOffset>
-                    </wp:positionV>
-                    <wp:extent cx="798830" cy="306705"/>
-                    <wp:effectExtent l="0" t="0" r="0" b="0"/>
-                    <wp:wrapNone/>
-                    <wp:docPr id="7" name="Text Box 18"/>
-                    <wp:cNvGraphicFramePr/>
-                    <a:graphic xmlns:a="http://schemas.openxmlformats.org/drawingml/2006/main">
-                      <a:graphicData uri="http://schemas.microsoft.com/office/word/2010/wordprocessingShape">
-                        <wps:wsp>
-                          <wps:cNvSpPr/>
-                          <wps:spPr>
-                            <a:xfrm>
-                              <a:off x="0" y="0"/>
-                              <a:ext cx="798840" cy="306720"/>
-                            </a:xfrm>
-                            <a:prstGeom prst="rect">
-                              <a:avLst/>
-                            </a:prstGeom>
-                            <a:noFill/>
-                            <a:ln w="0">
-                              <a:noFill/>
-                            </a:ln>
-                          </wps:spPr>
-                          <wps:style>
-                            <a:lnRef idx="0">
-                              <a:scrgbClr r="0" g="0" b="0"/>
-                            </a:lnRef>
-                            <a:fillRef idx="0">
-                              <a:scrgbClr r="0" g="0" b="0"/>
-                            </a:fillRef>
-                            <a:effectRef idx="0">
-                              <a:scrgbClr r="0" g="0" b="0"/>
-                            </a:effectRef>
-                            <a:fontRef idx="minor"/>
-                          </wps:style>
-                          <wps:txbx>
-                            <w:txbxContent>
-                              <w:p>
-                                <w:pPr>
-                                  <w:pStyle w:val="Form12"/>
-                                  <w:jc w:val="center"/>
-                                  <w:rPr>
-                                    <w:color w:val="000000"/>
-                                  </w:rPr>
-                                </w:pPr>
-                                <w:r>
-                                  <w:rPr>
-                                    <w:color w:val="000000"/>
-                                    <w:sz w:val="20"/>
-                                  </w:rPr>
-                                  <w:t>N° 3265-SD</w:t>
-                                </w:r>
-                              </w:p>
-                              <w:p>
-                                <w:pPr>
-                                  <w:pStyle w:val="Form12"/>
-                                  <w:rPr>
-                                    <w:color w:val="000000"/>
-                                  </w:rPr>
-                                </w:pPr>
-                              </w:p>
-                            </w:txbxContent>
-                          </wps:txbx>
-                          <wps:bodyPr lIns="5760" tIns="5760" rIns="5760" bIns="5760" anchor="t" upright="1">
-                            <a:noAutofit/>
-                          </wps:bodyPr>
-                        </wps:wsp>
-                      </a:graphicData>
-                    </a:graphic>
-                  </wp:anchor>
-                </w:drawing>
-              </mc:Choice>
-              <mc:Fallback>
-                <w:pict>
-                  <v:rect w14:anchorId="1C70B8E9" id="Text Box 18" o:spid="_x0000_s1029" style="position:absolute;left:0;text-align:left;margin-left:322.25pt;margin-top:14.55pt;width:62.9pt;height:24.15pt;z-index:-251660800;visibility:visible;mso-wrap-style:square;mso-wrap-distance-left:0;mso-wrap-distance-top:0;mso-wrap-distance-right:0;mso-wrap-distance-bottom:0;mso-position-horizontal:absolute;mso-position-horizontal-relative:text;mso-position-vertical:absolute;mso-position-vertical-relative:page;v-text-anchor:top" o:gfxdata="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" filled="f" stroked="f" strokeweight="0">
-                    <v:textbox inset=".16mm,.16mm,.16mm,.16mm">
-                      <w:txbxContent>
-                        <w:p>
-                          <w:pPr>
-                            <w:pStyle w:val="Form12"/>
-                            <w:jc w:val="center"/>
-                            <w:rPr>
-                              <w:color w:val="000000"/>
-                            </w:rPr>
-                          </w:pPr>
-                          <w:r>
-                            <w:rPr>
-                              <w:color w:val="000000"/>
-                              <w:sz w:val="20"/>
-                            </w:rPr>
-                            <w:t>N° 3265-SD</w:t>
-                          </w:r>
-                        </w:p>
-                        <w:p>
-                          <w:pPr>
-                            <w:pStyle w:val="Form12"/>
-                            <w:rPr>
-                              <w:color w:val="000000"/>
-                            </w:rPr>
-                          </w:pPr>
-                        </w:p>
-                      </w:txbxContent>
-                    </v:textbox>
-                    <w10:wrap anchory="page"/>
-                  </v:rect>
-                </w:pict>
-              </mc:Fallback>
-            </mc:AlternateContent>
-          </w:r>
-          <w:r>
-            <w:rPr>
-              <w:noProof/>
-            </w:rPr>
-            <w:drawing>
-              <wp:inline distT="0" distB="0" distL="0" distR="0" wp14:anchorId="60BD19D9" wp14:editId="0744DB86">
-                <wp:extent cx="694690" cy="367030"/>
-                <wp:effectExtent l="0" t="0" r="0" b="0"/>
-                <wp:docPr id="117643230" name="Graphique 1" descr="Logo République française&#10;Marianne dans le drapeau avec devise liberté - égalité - fraternité "/>
-                <wp:cNvGraphicFramePr>
-                  <a:graphicFrameLocks xmlns:a="http://schemas.openxmlformats.org/drawingml/2006/main" noChangeAspect="1"/>
-                </wp:cNvGraphicFramePr>
-                <a:graphic xmlns:a="http://schemas.openxmlformats.org/drawingml/2006/main">
-                  <a:graphicData uri="http://schemas.openxmlformats.org/drawingml/2006/picture">
-                    <pic:pic xmlns:pic="http://schemas.openxmlformats.org/drawingml/2006/picture">
-                      <pic:nvPicPr>
-                        <pic:cNvPr id="8" name="Graphique 1" descr="Logo République française&#10;Marianne dans le drapeau avec devise liberté - égalité - fraternité "/>
-                        <pic:cNvPicPr>
-                          <a:picLocks noChangeAspect="1" noChangeArrowheads="1"/>
-                        </pic:cNvPicPr>
-                      </pic:nvPicPr>
-                      <pic:blipFill>
-                        <a:blip r:embed="rId1">
-                          <a:extLst>
-                            <a:ext uri="{96DAC541-7B7A-43D3-8B79-37D633B846F1}">
-                              <asvg:svgBlip xmlns:asvg="http://schemas.microsoft.com/office/drawing/2016/SVG/main" r:embed="rId2"/>
-                            </a:ext>
-                          </a:extLst>
-                        </a:blip>
-                        <a:stretch>
-                          <a:fillRect/>
-                        </a:stretch>
-                      </pic:blipFill>
-                      <pic:spPr bwMode="auto">
-                        <a:xfrm>
-                          <a:off x="0" y="0"/>
-                          <a:ext cx="694690" cy="367030"/>
-                        </a:xfrm>
-                        <a:prstGeom prst="rect">
-                          <a:avLst/>
-                        </a:prstGeom>
-                      </pic:spPr>
-                    </pic:pic>
-                  </a:graphicData>
-                </a:graphic>
-              </wp:inline>
-            </w:drawing>
-          </w:r>
-        </w:p>
-        <w:p>
-          <w:pPr>
-            <w:pStyle w:val="Form16"/>
-          </w:pPr>
-          <w:r>
-            <w:t>Formule de publication</w:t>
-          </w:r>
-        </w:p>
-        <w:p>
-          <w:pPr>
-            <w:pStyle w:val="Form9"/>
-          </w:pPr>
-          <w:r>
-            <w:t>(pour l'établissement d'expéditions, copies, extraits d'actes ou décisions judiciaires à publier)</w:t>
-          </w:r>
-        </w:p>
-        <w:p/>
-      </w:tc>
-    </w:tr>
-    <w:tr>
-      <w:trPr>
-        <w:jc w:val="center"/>
-      </w:trPr>
-      <w:tc>
-        <w:tcPr>
-          <w:tcW w:w="2937" w:type="dxa"/>
-          <w:tcBorders>
-            <w:left w:val="nil"/>
-          </w:tcBorders>
-        </w:tcPr>
-        <w:p>
-          <w:pPr>
-            <w:jc w:val="center"/>
-            <w:rPr>
-              <w:sz w:val="4"/>
-            </w:rPr>
-          </w:pPr>
-        </w:p>
-        <w:p>
-          <w:pPr>
-            <w:pStyle w:val="Form10C"/>
-            <w:rPr>
-              <w:sz w:val="4"/>
-            </w:rPr>
-          </w:pPr>
-        </w:p>
-        <w:p>
-          <w:pPr>
-            <w:jc w:val="center"/>
-          </w:pPr>
-          <w:r>
-            <w:rPr>
-              <w:sz w:val="20"/>
-              <w:lang w:eastAsia="fr-FR"/>
-            </w:rPr>
-            <w:t>SERVICE</w:t>
-          </w:r>
-        </w:p>
-        <w:p>
-          <w:pPr>
-            <w:jc w:val="center"/>
-          </w:pPr>
-          <w:r>
-            <w:rPr>
-              <w:sz w:val="20"/>
-              <w:lang w:eastAsia="fr-FR"/>
-            </w:rPr>
-            <w:t>DE</w:t>
-          </w:r>
-        </w:p>
-        <w:p>
-          <w:pPr>
-            <w:pStyle w:val="Form10C"/>
-          </w:pPr>
-          <w:r>
-            <w:rPr>
-              <w:lang w:eastAsia="fr-FR"/>
-            </w:rPr>
-            <w:t>LA PUBLICITE FONCIERE</w:t>
-          </w:r>
-        </w:p>
-        <w:p/>
-      </w:tc>
-      <w:tc>
-        <w:tcPr>
-          <w:tcW w:w="2083" w:type="dxa"/>
-        </w:tcPr>
-        <w:p>
-          <w:pPr>
-            <w:pStyle w:val="Form10C"/>
-            <w:rPr>
-              <w:sz w:val="4"/>
-              <w:szCs w:val="4"/>
-            </w:rPr>
-          </w:pPr>
-        </w:p>
-        <w:p>
-          <w:pPr>
-            <w:pStyle w:val="Form10C"/>
-          </w:pPr>
-          <w:r>
-            <w:t>DÉPÔT</w:t>
-          </w:r>
-        </w:p>
-        <w:p/>
-      </w:tc>
-      <w:tc>
-        <w:tcPr>
-          <w:tcW w:w="3440" w:type="dxa"/>
-          <w:tcBorders>
-            <w:right w:val="nil"/>
-          </w:tcBorders>
-        </w:tcPr>
-        <w:p>
-          <w:pPr>
-            <w:rPr>
-              <w:sz w:val="4"/>
-              <w:szCs w:val="4"/>
-            </w:rPr>
-          </w:pPr>
-        </w:p>
-        <w:p>
-          <w:pPr>
-            <w:rPr>
-              <w:sz w:val="20"/>
-              <w:szCs w:val="20"/>
-            </w:rPr>
-          </w:pPr>
-          <w:r>
-            <w:rPr>
-              <w:sz w:val="20"/>
-              <w:szCs w:val="20"/>
-            </w:rPr>
-            <w:t>DATE</w:t>
-          </w:r>
-        </w:p>
-        <w:p>
-          <w:pPr>
-            <w:rPr>
-              <w:sz w:val="20"/>
-              <w:szCs w:val="20"/>
-            </w:rPr>
-          </w:pPr>
-        </w:p>
-        <w:p>
-          <w:pPr>
-            <w:rPr>
-              <w:sz w:val="20"/>
-              <w:szCs w:val="20"/>
-            </w:rPr>
-          </w:pPr>
-        </w:p>
-        <w:p>
-          <w:pPr>
-            <w:rPr>
-              <w:sz w:val="20"/>
-              <w:szCs w:val="20"/>
-            </w:rPr>
-          </w:pPr>
-          <w:r>
-            <w:rPr>
-              <w:sz w:val="20"/>
-              <w:szCs w:val="20"/>
-            </w:rPr>
-            <w:t>VOL                      N°</w:t>
-          </w:r>
-        </w:p>
-      </w:tc>
-    </w:tr>
-    <w:tr>
-      <w:trPr>
-        <w:jc w:val="center"/>
-      </w:trPr>
-      <w:tc>
-        <w:tcPr>
-          <w:tcW w:w="2937" w:type="dxa"/>
-          <w:tcBorders>
-            <w:left w:val="nil"/>
-          </w:tcBorders>
-        </w:tcPr>
-        <w:p/>
-      </w:tc>
-      <w:tc>
-        <w:tcPr>
-          <w:tcW w:w="5523" w:type="dxa"/>
-          <w:gridSpan w:val="2"/>
-          <w:tcBorders>
-            <w:right w:val="nil"/>
-          </w:tcBorders>
-        </w:tcPr>
-        <w:p>
-          <w:pPr>
-            <w:rPr>
-              <w:sz w:val="10"/>
-            </w:rPr>
-          </w:pPr>
-        </w:p>
-        <w:p>
-          <w:pPr>
-            <w:pStyle w:val="Form10J"/>
-          </w:pPr>
-          <w:r>
-            <w:rPr>
-              <w:rFonts w:eastAsia="Times New Roman"/>
-            </w:rPr>
-            <w:t xml:space="preserve"> </w:t>
-          </w:r>
-          <w:r>
-            <w:t>TAXES:</w:t>
-          </w:r>
-        </w:p>
-        <w:p>
-          <w:pPr>
-            <w:pStyle w:val="Form10J"/>
-          </w:pPr>
-        </w:p>
-        <w:p>
-          <w:pPr>
-            <w:pStyle w:val="Form10J"/>
-            <w:rPr>
-              <w:sz w:val="22"/>
-            </w:rPr>
-          </w:pPr>
-        </w:p>
-        <w:p>
-          <w:pPr>
-            <w:pStyle w:val="Form10J"/>
-          </w:pPr>
-          <w:r>
-            <w:t>CSI:</w:t>
-          </w:r>
-        </w:p>
-        <w:p>
-          <w:pPr>
-            <w:pStyle w:val="Form10J"/>
-          </w:pPr>
-        </w:p>
-        <w:p>
-          <w:pPr>
-            <w:pStyle w:val="Form10J"/>
-          </w:pPr>
-        </w:p>
-        <w:p>
-          <w:pPr>
-            <w:pStyle w:val="Form10J"/>
-            <w:rPr>
-              <w:sz w:val="2"/>
-            </w:rPr>
-          </w:pPr>
-        </w:p>
-        <w:p>
-          <w:pPr>
-            <w:pStyle w:val="Form10J"/>
-            <w:rPr>
-              <w:sz w:val="2"/>
-            </w:rPr>
-          </w:pPr>
-        </w:p>
-        <w:p>
-          <w:pPr>
-            <w:pStyle w:val="Form10J"/>
-          </w:pPr>
-          <w:r>
-            <w:rPr>
-              <w:rFonts w:eastAsia="Times New Roman"/>
-            </w:rPr>
-            <w:t xml:space="preserve">                                                         </w:t>
-          </w:r>
-          <w:r>
-            <w:t>TOTAL</w:t>
-          </w:r>
-        </w:p>
-        <w:p/>
-      </w:tc>
-    </w:tr>
-  </w:tbl>
   <w:p>
     <w:pPr>
       <w:pStyle w:val="En-tte"/>
@@ -10927,9 +10433,9 @@
         </mc:Choice>
         <mc:Fallback>
           <w:pict>
-            <v:group w14:anchorId="0DF62556" id="Group 14" o:spid="_x0000_s1030" alt="Numéro de page 1" style="position:absolute;left:0;text-align:left;margin-left:542.4pt;margin-top:15.2pt;width:21.4pt;height:20pt;z-index:-251659776;mso-wrap-distance-left:0;mso-wrap-distance-right:0;mso-position-horizontal-relative:page;mso-position-vertical-relative:page" coordsize="271800,254160" o:gfxdata="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" o:allowincell="f">
-              <v:roundrect id="AutoShape 15" o:spid="_x0000_s1031" style="position:absolute;left:4320;top:6480;width:267480;height:247680;visibility:visible;mso-wrap-style:square;v-text-anchor:top" arcsize="10923f" o:gfxdata="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" filled="f" stroked="f" strokeweight="0"/>
-              <v:rect id="Text Box 16" o:spid="_x0000_s1032" style="position:absolute;width:267480;height:247680;visibility:visible;mso-wrap-style:square;v-text-anchor:middle" o:gfxdata="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" filled="f" stroked="f" strokeweight="0">
+            <v:group w14:anchorId="0DF62556" id="Group 14" o:spid="_x0000_s1029" alt="Numéro de page 1" style="position:absolute;left:0;text-align:left;margin-left:542.4pt;margin-top:15.2pt;width:21.4pt;height:20pt;z-index:-251659776;mso-wrap-distance-left:0;mso-wrap-distance-right:0;mso-position-horizontal-relative:page;mso-position-vertical-relative:page" coordsize="271800,254160" o:gfxdata="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" o:allowincell="f">
+              <v:roundrect id="AutoShape 15" o:spid="_x0000_s1030" style="position:absolute;left:4320;top:6480;width:267480;height:247680;visibility:visible;mso-wrap-style:square;v-text-anchor:top" arcsize="10923f" o:gfxdata="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" filled="f" stroked="f" strokeweight="0"/>
+              <v:rect id="Text Box 16" o:spid="_x0000_s1031" style="position:absolute;width:267480;height:247680;visibility:visible;mso-wrap-style:square;v-text-anchor:middle" o:gfxdata="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" filled="f" stroked="f" strokeweight="0">
                 <v:textbox inset=".35mm,.35mm,.35mm,.35mm">
                   <w:txbxContent>
                     <w:p>
@@ -11048,10 +10554,10 @@
                                         </pic:cNvPicPr>
                                       </pic:nvPicPr>
                                       <pic:blipFill>
-                                        <a:blip r:embed="rId3">
+                                        <a:blip r:embed="rId1">
                                           <a:extLst>
                                             <a:ext uri="{96DAC541-7B7A-43D3-8B79-37D633B846F1}">
-                                              <asvg:svgBlip xmlns:asvg="http://schemas.microsoft.com/office/drawing/2016/SVG/main" r:embed="rId4"/>
+                                              <asvg:svgBlip xmlns:asvg="http://schemas.microsoft.com/office/drawing/2016/SVG/main" r:embed="rId2"/>
                                             </a:ext>
                                           </a:extLst>
                                         </a:blip>
@@ -11115,7 +10621,7 @@
         </mc:Choice>
         <mc:Fallback>
           <w:pict>
-            <v:rect w14:anchorId="0D3A2DC4" id="Text Box 17" o:spid="_x0000_s1033" style="position:absolute;left:0;text-align:left;margin-left:37.35pt;margin-top:21.15pt;width:78.5pt;height:49.7pt;z-index:-251658752;visibility:visible;mso-wrap-style:square;mso-wrap-distance-left:0;mso-wrap-distance-top:0;mso-wrap-distance-right:0;mso-wrap-distance-bottom:0;mso-position-horizontal:absolute;mso-position-horizontal-relative:page;mso-position-vertical:absolute;mso-position-vertical-relative:page;v-text-anchor:top" o:gfxdata="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" o:allowincell="f" filled="f" stroked="f" strokeweight="0">
+            <v:rect w14:anchorId="0D3A2DC4" id="Text Box 17" o:spid="_x0000_s1032" style="position:absolute;left:0;text-align:left;margin-left:37.35pt;margin-top:21.15pt;width:78.5pt;height:49.7pt;z-index:-251658752;visibility:visible;mso-wrap-style:square;mso-wrap-distance-left:0;mso-wrap-distance-top:0;mso-wrap-distance-right:0;mso-wrap-distance-bottom:0;mso-position-horizontal:absolute;mso-position-horizontal-relative:page;mso-position-vertical:absolute;mso-position-vertical-relative:page;v-text-anchor:top" o:gfxdata="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" o:allowincell="f" filled="f" stroked="f" strokeweight="0">
               <v:textbox inset=".16mm,.16mm,.16mm,.16mm">
                 <w:txbxContent>
                   <w:p>
@@ -11158,10 +10664,10 @@
                                   </pic:cNvPicPr>
                                 </pic:nvPicPr>
                                 <pic:blipFill>
-                                  <a:blip r:embed="rId3">
+                                  <a:blip r:embed="rId1">
                                     <a:extLst>
                                       <a:ext uri="{96DAC541-7B7A-43D3-8B79-37D633B846F1}">
-                                        <asvg:svgBlip xmlns:asvg="http://schemas.microsoft.com/office/drawing/2016/SVG/main" r:embed="rId4"/>
+                                        <asvg:svgBlip xmlns:asvg="http://schemas.microsoft.com/office/drawing/2016/SVG/main" r:embed="rId2"/>
                                       </a:ext>
                                     </a:extLst>
                                   </a:blip>
@@ -11299,7 +10805,7 @@
               <v:stroke joinstyle="miter"/>
               <v:path gradientshapeok="t" o:connecttype="rect"/>
             </v:shapetype>
-            <v:shape id="PowerPlusWaterMarkObject1357468906" o:spid="_x0000_s1034" type="#_x0000_t202" style="position:absolute;left:0;text-align:left;margin-left:0;margin-top:0;width:19.5pt;height:1.2pt;rotation:-45;z-index:-251655680;visibility:visible;mso-wrap-style:square;mso-wrap-distance-left:9pt;mso-wrap-distance-top:0;mso-wrap-distance-right:0;mso-wrap-distance-bottom:0;mso-position-horizontal:center;mso-position-horizontal-relative:margin;mso-position-vertical:center;mso-position-vertical-relative:margin;v-text-anchor:middle" o:gfxdata="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" o:allowincell="f" filled="f" stroked="f">
+            <v:shape id="PowerPlusWaterMarkObject1357468906" o:spid="_x0000_s1033" type="#_x0000_t202" style="position:absolute;left:0;text-align:left;margin-left:0;margin-top:0;width:19.5pt;height:1.2pt;rotation:-45;z-index:-251655680;visibility:visible;mso-wrap-style:square;mso-wrap-distance-left:9pt;mso-wrap-distance-top:0;mso-wrap-distance-right:0;mso-wrap-distance-bottom:0;mso-position-horizontal:center;mso-position-horizontal-relative:margin;mso-position-vertical:center;mso-position-vertical-relative:margin;v-text-anchor:middle" o:gfxdata="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" o:allowincell="f" filled="f" stroked="f">
               <v:textbox inset="0,0,0,0">
                 <w:txbxContent>
                   <w:p>

</xml_diff>

<commit_message>
AM204 Suppression des éléments liés à la publication au Service de la Publicité Foncière (SPF) (#2172)
* feat: ajout de la logique d'exclusion de SPF pour  les residences universitaire logements ordinaires et residences

* fix and add test logic

* feat: add post.html template and update ConventionPublicationView logic for SPF handling

* fix : refactoring __init__ de convention_form.py

---------

Co-authored-by: Ayoub BOUCHACHIA <bouchachiaayoub7@gmail.com>
</commit_message>
<xml_diff>
--- a/documents/Foyer-template.docx
+++ b/documents/Foyer-template.docx
@@ -175,11 +175,7 @@
         <w:t>1</w:t>
       </w:r>
       <w:r>
-        <w:t xml:space="preserve">], représenté (e) {%  if convention.signataire_nom %} {{ convention.signataire_nom }}, {{ convention.signataire_fonction }}{% else %} {{ bailleur.signataire_nom }}, {{ bailleur.signataire_fonction }}{% endif %} agissant en </w:t>
-      </w:r>
-      <w:r>
-        <w:lastRenderedPageBreak/>
-        <w:t xml:space="preserve">vertu de la délibération du Conseil d’Administration en date du {%  if convention.signataire_date_deliberation %}{{ convention.signataire_date_deliberation|d }}{% else %}{{ bailleur.signataire_date_deliberation|d }}{% endif %}, inscrit sous le numéro </w:t>
+        <w:t xml:space="preserve">], représenté (e) {%  if convention.signataire_nom %} {{ convention.signataire_nom }}, {{ convention.signataire_fonction }}{% else %} {{ bailleur.signataire_nom }}, {{ bailleur.signataire_fonction }}{% endif %} agissant en vertu de la délibération du Conseil d’Administration en date du {%  if convention.signataire_date_deliberation %}{{ convention.signataire_date_deliberation|d }}{% else %}{{ bailleur.signataire_date_deliberation|d }}{% endif %}, inscrit sous le numéro </w:t>
       </w:r>
       <w:bookmarkStart w:id="0" w:name="Siret1"/>
       <w:bookmarkEnd w:id="0"/>
@@ -216,7 +212,14 @@
         <w:rPr>
           <w:rFonts w:eastAsia="Arial Unicode MS"/>
         </w:rPr>
-        <w:t>{{ convention.gestionnaire|default_str_if_none|upper }} [Organisme agréé gestionnaire du logement-foyer, sauf dans le cas où le propriétaire est gestionnaire direct] représenté (e) par {{ convention.gestionnaire_signataire_nom|default_str_if_none }}, {{ convention.gestionnaire_signataire_fonction|default_str_if_none }} agissant en vertu de la délibération du Conseil d’Administration en date du {{ convention.gestionnaire_signataire_date_deliberation|dd }}, {{ convention.</w:t>
+        <w:t xml:space="preserve">{{ convention.gestionnaire|default_str_if_none|upper }} [Organisme agréé gestionnaire du logement-foyer, sauf dans le cas où le propriétaire est gestionnaire direct] représenté (e) par {{ convention.gestionnaire_signataire_nom|default_str_if_none }}, {{ convention.gestionnaire_signataire_fonction|default_str_if_none }} agissant en vertu de la délibération du Conseil d’Administration en date du {{ </w:t>
+      </w:r>
+      <w:r>
+        <w:rPr>
+          <w:rFonts w:eastAsia="Arial Unicode MS"/>
+        </w:rPr>
+        <w:lastRenderedPageBreak/>
+        <w:t>convention.gestionnaire_signataire_date_deliberation|dd }}, {{ convention.</w:t>
       </w:r>
       <w:r>
         <w:t xml:space="preserve"> </w:t>
@@ -3954,6 +3957,7 @@
         <w:rPr>
           <w:i/>
           <w:iCs/>
+          <w:color w:val="000000"/>
         </w:rPr>
       </w:pPr>
       <w:r>
@@ -3962,53 +3966,42 @@
           <w:iCs/>
           <w:color w:val="000000"/>
         </w:rPr>
-        <w:t>Publication</w:t>
-      </w:r>
-    </w:p>
-    <w:p>
-      <w:pPr>
-        <w:jc w:val="both"/>
-      </w:pPr>
-    </w:p>
-    <w:p>
-      <w:pPr>
-        <w:jc w:val="both"/>
-      </w:pPr>
-      <w:r>
-        <w:rPr>
-          <w:color w:val="000000"/>
-        </w:rPr>
-        <w:t>La publication de la convention, de sa résiliation et de ses éventuels avenants au fichier immobilier ou leur inscription au livre foncier incombe au préfet ou, lorsqu'un établissement public de coopération intercommunale, un département, la métropole de Lyon, la métropole du Grand Paris, la métropole d’Aix-Marseille-Provence, une métropole ou la collectivité de Corse a signé une convention mentionnée au II de l’article L. 301-5-1 ou à l’article L. 301-5-2 du code de la construction et de l'habitation, ou à l’article L. 3641-5, au VI de l’article L. 5219-1, au II de l’article L. 5218-2 ou au II de l’article L. 5217-2 du code général des collectivités territoriales, au président de l'établissement public de coopération intercommunale, du conseil départemental, de la métropole de Lyon, de la métropole du Grand Paris, de la métropole d’Aix-Marseille-Provence, de la métropole ou du conseil exécutif de Corse. Les frais de publication sont à la charge du propriétaire.</w:t>
-      </w:r>
-    </w:p>
-    <w:p>
-      <w:pPr>
-        <w:jc w:val="both"/>
-      </w:pPr>
-    </w:p>
-    <w:p>
-      <w:pPr>
-        <w:jc w:val="both"/>
-      </w:pPr>
-      <w:r>
-        <w:rPr>
-          <w:color w:val="000000"/>
-        </w:rPr>
-        <w:t>Le préfet, ou, lorsqu'un établissement public de coopération intercommunale, un département, la métropole de Lyon, la métropole du Grand Paris, la métropole d’Aix-</w:t>
-      </w:r>
-      <w:r>
-        <w:rPr>
-          <w:color w:val="000000"/>
-        </w:rPr>
-        <w:lastRenderedPageBreak/>
-        <w:t>Marseille-Provence, une métropole ou la collectivité de Corse a signé une convention mentionnée au II de l’article L. 301</w:t>
+        <w:t>Information des organismes chargés de la liquidation et du paiement de l’aide personnalisée au logement</w:t>
+      </w:r>
+    </w:p>
+    <w:p>
+      <w:pPr>
+        <w:jc w:val="both"/>
+      </w:pPr>
+    </w:p>
+    <w:p>
+      <w:pPr>
+        <w:jc w:val="both"/>
+      </w:pPr>
+      <w:r>
+        <w:rPr>
+          <w:color w:val="000000"/>
+        </w:rPr>
+        <w:t>Le préfet, ou, lorsqu'un établissement public de coopération intercommunale, un département, la métropole de Lyon, la métropole du Grand Paris, la métropole d’Aix-Marseille-Provence, une métropole ou la collectivité de Corse a signé une convention mentionnée au II de l’article L. 301</w:t>
       </w:r>
       <w:r>
         <w:rPr>
           <w:color w:val="000000"/>
         </w:rPr>
         <w:noBreakHyphen/>
-        <w:t>5-1 ou à l’article L. 301-5-2 du code de la construction et de l'habitation, ou à l’article L. 3641-5, au VI de l’article L. 5219-1, au II de l’article L. 5218-2 ou au II de l’article L. 5217-2 du code général des collectivités territoriales, le président de l'établissement public de coopération intercommunale, du conseil départemental, de la métropole de Lyon, de la métropole du Grand Paris, de la métropole d’Aix-Marseille-Provence, de la métropole ou du conseil exécutif de Corse, transmet aux organismes chargés de la liquidation et du paiement de l'aide personnalisée au logement une copie de la présente convention, de ses avenants éventuels ainsi que l'état prouvant qu'elle (ou ils) a (ont) bien fait l'objet d'une publication au fichier immobilier (ou d'une inscription au livre foncier).{% endif %}</w:t>
+        <w:t>5-1 ou à l’article L. 301-5-2 du code de la construction et de l'habitation, ou à l’article L. 3641-5, au VI de l’article L. 5219-1, au II de l’article L. 5218-2 ou au II de l’article L. 5217-2 du code général des collectivités territoriales, le président de l'établissement public de coopération intercommunale, du conseil départemental, de la métropole de Lyon, de la métropole du Grand Paris, de la métropole d’Aix-Marseille-Provence, de la métropole ou du conseil exécutif de Corse, transmet aux organismes chargés de la liquidation et du paiement de l'aide personnalisée au logement une copie de la présente convention</w:t>
+      </w:r>
+      <w:r>
+        <w:rPr>
+          <w:color w:val="000000"/>
+        </w:rPr>
+        <w:t xml:space="preserve"> et de ses avenants éventuels</w:t>
+      </w:r>
+      <w:r>
+        <w:rPr>
+          <w:color w:val="000000"/>
+        </w:rPr>
+        <w:t>.{% endif %}</w:t>
       </w:r>
     </w:p>
     <w:p>
@@ -10240,493 +10233,6 @@
 
 <file path=word/header3.xml><?xml version="1.0" encoding="utf-8"?>
 <w:hdr xmlns:wpc="http://schemas.microsoft.com/office/word/2010/wordprocessingCanvas" xmlns:cx="http://schemas.microsoft.com/office/drawing/2014/chartex" xmlns:cx1="http://schemas.microsoft.com/office/drawing/2015/9/8/chartex" xmlns:cx2="http://schemas.microsoft.com/office/drawing/2015/10/21/chartex" xmlns:cx3="http://schemas.microsoft.com/office/drawing/2016/5/9/chartex" xmlns:cx4="http://schemas.microsoft.com/office/drawing/2016/5/10/chartex" xmlns:cx5="http://schemas.microsoft.com/office/drawing/2016/5/11/chartex" xmlns:cx6="http://schemas.microsoft.com/office/drawing/2016/5/12/chartex" xmlns:cx7="http://schemas.microsoft.com/office/drawing/2016/5/13/chartex" xmlns:cx8="http://schemas.microsoft.com/office/drawing/2016/5/14/chartex" xmlns:mc="http://schemas.openxmlformats.org/markup-compatibility/2006" xmlns:aink="http://schemas.microsoft.com/office/drawing/2016/ink" xmlns:am3d="http://schemas.microsoft.com/office/drawing/2017/model3d" xmlns:o="urn:schemas-microsoft-com:office:office" xmlns:oel="http://schemas.microsoft.com/office/2019/extlst" xmlns:r="http://schemas.openxmlformats.org/officeDocument/2006/relationships" xmlns:m="http://schemas.openxmlformats.org/officeDocument/2006/math" xmlns:v="urn:schemas-microsoft-com:vml" xmlns:wp14="http://schemas.microsoft.com/office/word/2010/wordprocessingDrawing" xmlns:wp="http://schemas.openxmlformats.org/drawingml/2006/wordprocessingDrawing" xmlns:w10="urn:schemas-microsoft-com:office:word" xmlns:w="http://schemas.openxmlformats.org/wordprocessingml/2006/main" xmlns:w14="http://schemas.microsoft.com/office/word/2010/wordml" xmlns:w15="http://schemas.microsoft.com/office/word/2012/wordml" xmlns:w16cex="http://schemas.microsoft.com/office/word/2018/wordml/cex" xmlns:w16cid="http://schemas.microsoft.com/office/word/2016/wordml/cid" xmlns:w16="http://schemas.microsoft.com/office/word/2018/wordml" xmlns:w16du="http://schemas.microsoft.com/office/word/2023/wordml/word16du" xmlns:w16sdtdh="http://schemas.microsoft.com/office/word/2020/wordml/sdtdatahash" xmlns:w16sdtfl="http://schemas.microsoft.com/office/word/2024/wordml/sdtformatlock" xmlns:w16se="http://schemas.microsoft.com/office/word/2015/wordml/symex" xmlns:wpg="http://schemas.microsoft.com/office/word/2010/wordprocessingGroup" xmlns:wpi="http://schemas.microsoft.com/office/word/2010/wordprocessingInk" xmlns:wne="http://schemas.microsoft.com/office/word/2006/wordml" xmlns:wps="http://schemas.microsoft.com/office/word/2010/wordprocessingShape" mc:Ignorable="w14 w15 w16se w16cid w16 w16cex w16sdtdh w16sdtfl w16du wp14">
-  <w:tbl>
-    <w:tblPr>
-      <w:tblStyle w:val="Grilledutableau"/>
-      <w:tblW w:w="8460" w:type="dxa"/>
-      <w:jc w:val="center"/>
-      <w:tblLayout w:type="fixed"/>
-      <w:tblLook w:val="04A0" w:firstRow="1" w:lastRow="0" w:firstColumn="1" w:lastColumn="0" w:noHBand="0" w:noVBand="1"/>
-    </w:tblPr>
-    <w:tblGrid>
-      <w:gridCol w:w="2937"/>
-      <w:gridCol w:w="2083"/>
-      <w:gridCol w:w="3440"/>
-    </w:tblGrid>
-    <w:tr>
-      <w:trPr>
-        <w:jc w:val="center"/>
-      </w:trPr>
-      <w:tc>
-        <w:tcPr>
-          <w:tcW w:w="8460" w:type="dxa"/>
-          <w:gridSpan w:val="3"/>
-          <w:tcBorders>
-            <w:top w:val="nil"/>
-            <w:left w:val="nil"/>
-            <w:right w:val="nil"/>
-          </w:tcBorders>
-        </w:tcPr>
-        <w:p>
-          <w:pPr>
-            <w:rPr>
-              <w:sz w:val="12"/>
-              <w:szCs w:val="12"/>
-            </w:rPr>
-          </w:pPr>
-        </w:p>
-        <w:p>
-          <w:pPr>
-            <w:jc w:val="center"/>
-          </w:pPr>
-          <w:r>
-            <w:rPr>
-              <w:noProof/>
-            </w:rPr>
-            <mc:AlternateContent>
-              <mc:Choice Requires="wps">
-                <w:drawing>
-                  <wp:anchor distT="0" distB="0" distL="0" distR="0" simplePos="0" relativeHeight="251655680" behindDoc="1" locked="0" layoutInCell="1" allowOverlap="1" wp14:anchorId="1C70B8E9" wp14:editId="2B727346">
-                    <wp:simplePos x="0" y="0"/>
-                    <wp:positionH relativeFrom="column">
-                      <wp:posOffset>4092575</wp:posOffset>
-                    </wp:positionH>
-                    <wp:positionV relativeFrom="page">
-                      <wp:posOffset>184785</wp:posOffset>
-                    </wp:positionV>
-                    <wp:extent cx="798830" cy="306705"/>
-                    <wp:effectExtent l="0" t="0" r="0" b="0"/>
-                    <wp:wrapNone/>
-                    <wp:docPr id="7" name="Text Box 18"/>
-                    <wp:cNvGraphicFramePr/>
-                    <a:graphic xmlns:a="http://schemas.openxmlformats.org/drawingml/2006/main">
-                      <a:graphicData uri="http://schemas.microsoft.com/office/word/2010/wordprocessingShape">
-                        <wps:wsp>
-                          <wps:cNvSpPr/>
-                          <wps:spPr>
-                            <a:xfrm>
-                              <a:off x="0" y="0"/>
-                              <a:ext cx="798840" cy="306720"/>
-                            </a:xfrm>
-                            <a:prstGeom prst="rect">
-                              <a:avLst/>
-                            </a:prstGeom>
-                            <a:noFill/>
-                            <a:ln w="0">
-                              <a:noFill/>
-                            </a:ln>
-                          </wps:spPr>
-                          <wps:style>
-                            <a:lnRef idx="0">
-                              <a:scrgbClr r="0" g="0" b="0"/>
-                            </a:lnRef>
-                            <a:fillRef idx="0">
-                              <a:scrgbClr r="0" g="0" b="0"/>
-                            </a:fillRef>
-                            <a:effectRef idx="0">
-                              <a:scrgbClr r="0" g="0" b="0"/>
-                            </a:effectRef>
-                            <a:fontRef idx="minor"/>
-                          </wps:style>
-                          <wps:txbx>
-                            <w:txbxContent>
-                              <w:p>
-                                <w:pPr>
-                                  <w:pStyle w:val="Form12"/>
-                                  <w:jc w:val="center"/>
-                                  <w:rPr>
-                                    <w:color w:val="000000"/>
-                                  </w:rPr>
-                                </w:pPr>
-                                <w:r>
-                                  <w:rPr>
-                                    <w:color w:val="000000"/>
-                                    <w:sz w:val="20"/>
-                                  </w:rPr>
-                                  <w:t>N° 3265-SD</w:t>
-                                </w:r>
-                              </w:p>
-                              <w:p>
-                                <w:pPr>
-                                  <w:pStyle w:val="Form12"/>
-                                  <w:rPr>
-                                    <w:color w:val="000000"/>
-                                  </w:rPr>
-                                </w:pPr>
-                              </w:p>
-                            </w:txbxContent>
-                          </wps:txbx>
-                          <wps:bodyPr lIns="5760" tIns="5760" rIns="5760" bIns="5760" anchor="t" upright="1">
-                            <a:noAutofit/>
-                          </wps:bodyPr>
-                        </wps:wsp>
-                      </a:graphicData>
-                    </a:graphic>
-                  </wp:anchor>
-                </w:drawing>
-              </mc:Choice>
-              <mc:Fallback>
-                <w:pict>
-                  <v:rect w14:anchorId="1C70B8E9" id="Text Box 18" o:spid="_x0000_s1029" style="position:absolute;left:0;text-align:left;margin-left:322.25pt;margin-top:14.55pt;width:62.9pt;height:24.15pt;z-index:-251660800;visibility:visible;mso-wrap-style:square;mso-wrap-distance-left:0;mso-wrap-distance-top:0;mso-wrap-distance-right:0;mso-wrap-distance-bottom:0;mso-position-horizontal:absolute;mso-position-horizontal-relative:text;mso-position-vertical:absolute;mso-position-vertical-relative:page;v-text-anchor:top" o:gfxdata="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" filled="f" stroked="f" strokeweight="0">
-                    <v:textbox inset=".16mm,.16mm,.16mm,.16mm">
-                      <w:txbxContent>
-                        <w:p>
-                          <w:pPr>
-                            <w:pStyle w:val="Form12"/>
-                            <w:jc w:val="center"/>
-                            <w:rPr>
-                              <w:color w:val="000000"/>
-                            </w:rPr>
-                          </w:pPr>
-                          <w:r>
-                            <w:rPr>
-                              <w:color w:val="000000"/>
-                              <w:sz w:val="20"/>
-                            </w:rPr>
-                            <w:t>N° 3265-SD</w:t>
-                          </w:r>
-                        </w:p>
-                        <w:p>
-                          <w:pPr>
-                            <w:pStyle w:val="Form12"/>
-                            <w:rPr>
-                              <w:color w:val="000000"/>
-                            </w:rPr>
-                          </w:pPr>
-                        </w:p>
-                      </w:txbxContent>
-                    </v:textbox>
-                    <w10:wrap anchory="page"/>
-                  </v:rect>
-                </w:pict>
-              </mc:Fallback>
-            </mc:AlternateContent>
-          </w:r>
-          <w:r>
-            <w:rPr>
-              <w:noProof/>
-            </w:rPr>
-            <w:drawing>
-              <wp:inline distT="0" distB="0" distL="0" distR="0" wp14:anchorId="60BD19D9" wp14:editId="0744DB86">
-                <wp:extent cx="694690" cy="367030"/>
-                <wp:effectExtent l="0" t="0" r="0" b="0"/>
-                <wp:docPr id="117643230" name="Graphique 1" descr="Logo République française&#10;Marianne dans le drapeau avec devise liberté - égalité - fraternité "/>
-                <wp:cNvGraphicFramePr>
-                  <a:graphicFrameLocks xmlns:a="http://schemas.openxmlformats.org/drawingml/2006/main" noChangeAspect="1"/>
-                </wp:cNvGraphicFramePr>
-                <a:graphic xmlns:a="http://schemas.openxmlformats.org/drawingml/2006/main">
-                  <a:graphicData uri="http://schemas.openxmlformats.org/drawingml/2006/picture">
-                    <pic:pic xmlns:pic="http://schemas.openxmlformats.org/drawingml/2006/picture">
-                      <pic:nvPicPr>
-                        <pic:cNvPr id="8" name="Graphique 1" descr="Logo République française&#10;Marianne dans le drapeau avec devise liberté - égalité - fraternité "/>
-                        <pic:cNvPicPr>
-                          <a:picLocks noChangeAspect="1" noChangeArrowheads="1"/>
-                        </pic:cNvPicPr>
-                      </pic:nvPicPr>
-                      <pic:blipFill>
-                        <a:blip r:embed="rId1">
-                          <a:extLst>
-                            <a:ext uri="{96DAC541-7B7A-43D3-8B79-37D633B846F1}">
-                              <asvg:svgBlip xmlns:asvg="http://schemas.microsoft.com/office/drawing/2016/SVG/main" r:embed="rId2"/>
-                            </a:ext>
-                          </a:extLst>
-                        </a:blip>
-                        <a:stretch>
-                          <a:fillRect/>
-                        </a:stretch>
-                      </pic:blipFill>
-                      <pic:spPr bwMode="auto">
-                        <a:xfrm>
-                          <a:off x="0" y="0"/>
-                          <a:ext cx="694690" cy="367030"/>
-                        </a:xfrm>
-                        <a:prstGeom prst="rect">
-                          <a:avLst/>
-                        </a:prstGeom>
-                      </pic:spPr>
-                    </pic:pic>
-                  </a:graphicData>
-                </a:graphic>
-              </wp:inline>
-            </w:drawing>
-          </w:r>
-        </w:p>
-        <w:p>
-          <w:pPr>
-            <w:pStyle w:val="Form16"/>
-          </w:pPr>
-          <w:r>
-            <w:t>Formule de publication</w:t>
-          </w:r>
-        </w:p>
-        <w:p>
-          <w:pPr>
-            <w:pStyle w:val="Form9"/>
-          </w:pPr>
-          <w:r>
-            <w:t>(pour l'établissement d'expéditions, copies, extraits d'actes ou décisions judiciaires à publier)</w:t>
-          </w:r>
-        </w:p>
-        <w:p/>
-      </w:tc>
-    </w:tr>
-    <w:tr>
-      <w:trPr>
-        <w:jc w:val="center"/>
-      </w:trPr>
-      <w:tc>
-        <w:tcPr>
-          <w:tcW w:w="2937" w:type="dxa"/>
-          <w:tcBorders>
-            <w:left w:val="nil"/>
-          </w:tcBorders>
-        </w:tcPr>
-        <w:p>
-          <w:pPr>
-            <w:jc w:val="center"/>
-            <w:rPr>
-              <w:sz w:val="4"/>
-            </w:rPr>
-          </w:pPr>
-        </w:p>
-        <w:p>
-          <w:pPr>
-            <w:pStyle w:val="Form10C"/>
-            <w:rPr>
-              <w:sz w:val="4"/>
-            </w:rPr>
-          </w:pPr>
-        </w:p>
-        <w:p>
-          <w:pPr>
-            <w:jc w:val="center"/>
-          </w:pPr>
-          <w:r>
-            <w:rPr>
-              <w:sz w:val="20"/>
-              <w:lang w:eastAsia="fr-FR"/>
-            </w:rPr>
-            <w:t>SERVICE</w:t>
-          </w:r>
-        </w:p>
-        <w:p>
-          <w:pPr>
-            <w:jc w:val="center"/>
-          </w:pPr>
-          <w:r>
-            <w:rPr>
-              <w:sz w:val="20"/>
-              <w:lang w:eastAsia="fr-FR"/>
-            </w:rPr>
-            <w:t>DE</w:t>
-          </w:r>
-        </w:p>
-        <w:p>
-          <w:pPr>
-            <w:pStyle w:val="Form10C"/>
-          </w:pPr>
-          <w:r>
-            <w:rPr>
-              <w:lang w:eastAsia="fr-FR"/>
-            </w:rPr>
-            <w:t>LA PUBLICITE FONCIERE</w:t>
-          </w:r>
-        </w:p>
-        <w:p/>
-      </w:tc>
-      <w:tc>
-        <w:tcPr>
-          <w:tcW w:w="2083" w:type="dxa"/>
-        </w:tcPr>
-        <w:p>
-          <w:pPr>
-            <w:pStyle w:val="Form10C"/>
-            <w:rPr>
-              <w:sz w:val="4"/>
-              <w:szCs w:val="4"/>
-            </w:rPr>
-          </w:pPr>
-        </w:p>
-        <w:p>
-          <w:pPr>
-            <w:pStyle w:val="Form10C"/>
-          </w:pPr>
-          <w:r>
-            <w:t>DÉPÔT</w:t>
-          </w:r>
-        </w:p>
-        <w:p/>
-      </w:tc>
-      <w:tc>
-        <w:tcPr>
-          <w:tcW w:w="3440" w:type="dxa"/>
-          <w:tcBorders>
-            <w:right w:val="nil"/>
-          </w:tcBorders>
-        </w:tcPr>
-        <w:p>
-          <w:pPr>
-            <w:rPr>
-              <w:sz w:val="4"/>
-              <w:szCs w:val="4"/>
-            </w:rPr>
-          </w:pPr>
-        </w:p>
-        <w:p>
-          <w:pPr>
-            <w:rPr>
-              <w:sz w:val="20"/>
-              <w:szCs w:val="20"/>
-            </w:rPr>
-          </w:pPr>
-          <w:r>
-            <w:rPr>
-              <w:sz w:val="20"/>
-              <w:szCs w:val="20"/>
-            </w:rPr>
-            <w:t>DATE</w:t>
-          </w:r>
-        </w:p>
-        <w:p>
-          <w:pPr>
-            <w:rPr>
-              <w:sz w:val="20"/>
-              <w:szCs w:val="20"/>
-            </w:rPr>
-          </w:pPr>
-        </w:p>
-        <w:p>
-          <w:pPr>
-            <w:rPr>
-              <w:sz w:val="20"/>
-              <w:szCs w:val="20"/>
-            </w:rPr>
-          </w:pPr>
-        </w:p>
-        <w:p>
-          <w:pPr>
-            <w:rPr>
-              <w:sz w:val="20"/>
-              <w:szCs w:val="20"/>
-            </w:rPr>
-          </w:pPr>
-          <w:r>
-            <w:rPr>
-              <w:sz w:val="20"/>
-              <w:szCs w:val="20"/>
-            </w:rPr>
-            <w:t>VOL                      N°</w:t>
-          </w:r>
-        </w:p>
-      </w:tc>
-    </w:tr>
-    <w:tr>
-      <w:trPr>
-        <w:jc w:val="center"/>
-      </w:trPr>
-      <w:tc>
-        <w:tcPr>
-          <w:tcW w:w="2937" w:type="dxa"/>
-          <w:tcBorders>
-            <w:left w:val="nil"/>
-          </w:tcBorders>
-        </w:tcPr>
-        <w:p/>
-      </w:tc>
-      <w:tc>
-        <w:tcPr>
-          <w:tcW w:w="5523" w:type="dxa"/>
-          <w:gridSpan w:val="2"/>
-          <w:tcBorders>
-            <w:right w:val="nil"/>
-          </w:tcBorders>
-        </w:tcPr>
-        <w:p>
-          <w:pPr>
-            <w:rPr>
-              <w:sz w:val="10"/>
-            </w:rPr>
-          </w:pPr>
-        </w:p>
-        <w:p>
-          <w:pPr>
-            <w:pStyle w:val="Form10J"/>
-          </w:pPr>
-          <w:r>
-            <w:rPr>
-              <w:rFonts w:eastAsia="Times New Roman"/>
-            </w:rPr>
-            <w:t xml:space="preserve"> </w:t>
-          </w:r>
-          <w:r>
-            <w:t>TAXES:</w:t>
-          </w:r>
-        </w:p>
-        <w:p>
-          <w:pPr>
-            <w:pStyle w:val="Form10J"/>
-          </w:pPr>
-        </w:p>
-        <w:p>
-          <w:pPr>
-            <w:pStyle w:val="Form10J"/>
-            <w:rPr>
-              <w:sz w:val="22"/>
-            </w:rPr>
-          </w:pPr>
-        </w:p>
-        <w:p>
-          <w:pPr>
-            <w:pStyle w:val="Form10J"/>
-          </w:pPr>
-          <w:r>
-            <w:t>CSI:</w:t>
-          </w:r>
-        </w:p>
-        <w:p>
-          <w:pPr>
-            <w:pStyle w:val="Form10J"/>
-          </w:pPr>
-        </w:p>
-        <w:p>
-          <w:pPr>
-            <w:pStyle w:val="Form10J"/>
-          </w:pPr>
-        </w:p>
-        <w:p>
-          <w:pPr>
-            <w:pStyle w:val="Form10J"/>
-            <w:rPr>
-              <w:sz w:val="2"/>
-            </w:rPr>
-          </w:pPr>
-        </w:p>
-        <w:p>
-          <w:pPr>
-            <w:pStyle w:val="Form10J"/>
-            <w:rPr>
-              <w:sz w:val="2"/>
-            </w:rPr>
-          </w:pPr>
-        </w:p>
-        <w:p>
-          <w:pPr>
-            <w:pStyle w:val="Form10J"/>
-          </w:pPr>
-          <w:r>
-            <w:rPr>
-              <w:rFonts w:eastAsia="Times New Roman"/>
-            </w:rPr>
-            <w:t xml:space="preserve">                                                         </w:t>
-          </w:r>
-          <w:r>
-            <w:t>TOTAL</w:t>
-          </w:r>
-        </w:p>
-        <w:p/>
-      </w:tc>
-    </w:tr>
-  </w:tbl>
   <w:p>
     <w:pPr>
       <w:pStyle w:val="En-tte"/>
@@ -10927,9 +10433,9 @@
         </mc:Choice>
         <mc:Fallback>
           <w:pict>
-            <v:group w14:anchorId="0DF62556" id="Group 14" o:spid="_x0000_s1030" alt="Numéro de page 1" style="position:absolute;left:0;text-align:left;margin-left:542.4pt;margin-top:15.2pt;width:21.4pt;height:20pt;z-index:-251659776;mso-wrap-distance-left:0;mso-wrap-distance-right:0;mso-position-horizontal-relative:page;mso-position-vertical-relative:page" coordsize="271800,254160" o:gfxdata="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" o:allowincell="f">
-              <v:roundrect id="AutoShape 15" o:spid="_x0000_s1031" style="position:absolute;left:4320;top:6480;width:267480;height:247680;visibility:visible;mso-wrap-style:square;v-text-anchor:top" arcsize="10923f" o:gfxdata="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" filled="f" stroked="f" strokeweight="0"/>
-              <v:rect id="Text Box 16" o:spid="_x0000_s1032" style="position:absolute;width:267480;height:247680;visibility:visible;mso-wrap-style:square;v-text-anchor:middle" o:gfxdata="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" filled="f" stroked="f" strokeweight="0">
+            <v:group w14:anchorId="0DF62556" id="Group 14" o:spid="_x0000_s1029" alt="Numéro de page 1" style="position:absolute;left:0;text-align:left;margin-left:542.4pt;margin-top:15.2pt;width:21.4pt;height:20pt;z-index:-251659776;mso-wrap-distance-left:0;mso-wrap-distance-right:0;mso-position-horizontal-relative:page;mso-position-vertical-relative:page" coordsize="271800,254160" o:gfxdata="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" o:allowincell="f">
+              <v:roundrect id="AutoShape 15" o:spid="_x0000_s1030" style="position:absolute;left:4320;top:6480;width:267480;height:247680;visibility:visible;mso-wrap-style:square;v-text-anchor:top" arcsize="10923f" o:gfxdata="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" filled="f" stroked="f" strokeweight="0"/>
+              <v:rect id="Text Box 16" o:spid="_x0000_s1031" style="position:absolute;width:267480;height:247680;visibility:visible;mso-wrap-style:square;v-text-anchor:middle" o:gfxdata="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" filled="f" stroked="f" strokeweight="0">
                 <v:textbox inset=".35mm,.35mm,.35mm,.35mm">
                   <w:txbxContent>
                     <w:p>
@@ -11048,10 +10554,10 @@
                                         </pic:cNvPicPr>
                                       </pic:nvPicPr>
                                       <pic:blipFill>
-                                        <a:blip r:embed="rId3">
+                                        <a:blip r:embed="rId1">
                                           <a:extLst>
                                             <a:ext uri="{96DAC541-7B7A-43D3-8B79-37D633B846F1}">
-                                              <asvg:svgBlip xmlns:asvg="http://schemas.microsoft.com/office/drawing/2016/SVG/main" r:embed="rId4"/>
+                                              <asvg:svgBlip xmlns:asvg="http://schemas.microsoft.com/office/drawing/2016/SVG/main" r:embed="rId2"/>
                                             </a:ext>
                                           </a:extLst>
                                         </a:blip>
@@ -11115,7 +10621,7 @@
         </mc:Choice>
         <mc:Fallback>
           <w:pict>
-            <v:rect w14:anchorId="0D3A2DC4" id="Text Box 17" o:spid="_x0000_s1033" style="position:absolute;left:0;text-align:left;margin-left:37.35pt;margin-top:21.15pt;width:78.5pt;height:49.7pt;z-index:-251658752;visibility:visible;mso-wrap-style:square;mso-wrap-distance-left:0;mso-wrap-distance-top:0;mso-wrap-distance-right:0;mso-wrap-distance-bottom:0;mso-position-horizontal:absolute;mso-position-horizontal-relative:page;mso-position-vertical:absolute;mso-position-vertical-relative:page;v-text-anchor:top" o:gfxdata="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" o:allowincell="f" filled="f" stroked="f" strokeweight="0">
+            <v:rect w14:anchorId="0D3A2DC4" id="Text Box 17" o:spid="_x0000_s1032" style="position:absolute;left:0;text-align:left;margin-left:37.35pt;margin-top:21.15pt;width:78.5pt;height:49.7pt;z-index:-251658752;visibility:visible;mso-wrap-style:square;mso-wrap-distance-left:0;mso-wrap-distance-top:0;mso-wrap-distance-right:0;mso-wrap-distance-bottom:0;mso-position-horizontal:absolute;mso-position-horizontal-relative:page;mso-position-vertical:absolute;mso-position-vertical-relative:page;v-text-anchor:top" o:gfxdata="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" o:allowincell="f" filled="f" stroked="f" strokeweight="0">
               <v:textbox inset=".16mm,.16mm,.16mm,.16mm">
                 <w:txbxContent>
                   <w:p>
@@ -11158,10 +10664,10 @@
                                   </pic:cNvPicPr>
                                 </pic:nvPicPr>
                                 <pic:blipFill>
-                                  <a:blip r:embed="rId3">
+                                  <a:blip r:embed="rId1">
                                     <a:extLst>
                                       <a:ext uri="{96DAC541-7B7A-43D3-8B79-37D633B846F1}">
-                                        <asvg:svgBlip xmlns:asvg="http://schemas.microsoft.com/office/drawing/2016/SVG/main" r:embed="rId4"/>
+                                        <asvg:svgBlip xmlns:asvg="http://schemas.microsoft.com/office/drawing/2016/SVG/main" r:embed="rId2"/>
                                       </a:ext>
                                     </a:extLst>
                                   </a:blip>
@@ -11299,7 +10805,7 @@
               <v:stroke joinstyle="miter"/>
               <v:path gradientshapeok="t" o:connecttype="rect"/>
             </v:shapetype>
-            <v:shape id="PowerPlusWaterMarkObject1357468906" o:spid="_x0000_s1034" type="#_x0000_t202" style="position:absolute;left:0;text-align:left;margin-left:0;margin-top:0;width:19.5pt;height:1.2pt;rotation:-45;z-index:-251655680;visibility:visible;mso-wrap-style:square;mso-wrap-distance-left:9pt;mso-wrap-distance-top:0;mso-wrap-distance-right:0;mso-wrap-distance-bottom:0;mso-position-horizontal:center;mso-position-horizontal-relative:margin;mso-position-vertical:center;mso-position-vertical-relative:margin;v-text-anchor:middle" o:gfxdata="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" o:allowincell="f" filled="f" stroked="f">
+            <v:shape id="PowerPlusWaterMarkObject1357468906" o:spid="_x0000_s1033" type="#_x0000_t202" style="position:absolute;left:0;text-align:left;margin-left:0;margin-top:0;width:19.5pt;height:1.2pt;rotation:-45;z-index:-251655680;visibility:visible;mso-wrap-style:square;mso-wrap-distance-left:9pt;mso-wrap-distance-top:0;mso-wrap-distance-right:0;mso-wrap-distance-bottom:0;mso-position-horizontal:center;mso-position-horizontal-relative:margin;mso-position-vertical:center;mso-position-vertical-relative:margin;v-text-anchor:middle" o:gfxdata="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" o:allowincell="f" filled="f" stroked="f">
               <v:textbox inset="0,0,0,0">
                 <w:txbxContent>
                   <w:p>

</xml_diff>